<commit_message>
Add cross-family generality (wav2vec2): second ASR family, results, and paper section 5.6
</commit_message>
<xml_diff>
--- a/paper/ASR_L2_paper.docx
+++ b/paper/ASR_L2_paper.docx
@@ -109,7 +109,7 @@
         <w:t xml:space="preserve">audio-free</w:t>
       </w:r>
       <w:r>
-        <w:t xml:space="preserve"> adaptation - n-best rescoring with text-only language models, both a weak domain n-gram and a strong neural LM - can recover any of this error on the frozen decoder. On Indian-accented Svarah and the L2-ARCTIC learner corpus we find the streaming penalty is large and monotonic (WER rises up to ~5x from offline to 320 ms chunks); roughly 51% of L2-ARCTIC errors coincide with genuine mispronunciations while the remainder are model errors on correct speech; and whether audio-free rescoring helps follows a clean 2x2 in LM strength and speech type. A weak domain n-gram never yields a test-set gain: its dev improvement fails to generalize. A strong, zero-shot GPT-2 gives an 8.0% relative WER reduction on L2-ARCTIC read speech across 24 speakers (four per L1), significant under a speaker-level cluster bootstrap (p = 0.0003) and robust across ASR model sizes (tiny/base/small.en, larger on the weaker models) - but the same strong LM gives no gain on spontaneous Svarah. The error taxonomy explains the pattern: a strong LM can re-rank lexical errors when the n-best contains a better wording, but the roughly half of errors that are accent-driven (51% by phoneme ground truth) remain beyond any text model, bounding the gain and eliminating it on spontaneous speech. Audio-free adaptation is thus a cheap, safe, modest add-on in strong-LM read-speech settings, not a general remedy for the accent gap. All code and derived results are released for reproducibility.</w:t>
+        <w:t xml:space="preserve"> adaptation - n-best rescoring with text-only language models, both a weak domain n-gram and a strong neural LM - can recover any of this error on the frozen decoder. On Indian-accented Svarah and the L2-ARCTIC learner corpus we find the streaming penalty is large and monotonic (WER rises up to ~5x from offline to 320 ms chunks); roughly 51% of L2-ARCTIC errors coincide with genuine mispronunciations while the remainder are model errors on correct speech; and whether audio-free rescoring helps follows a clean 2x2 in LM strength and speech type. A weak domain n-gram never yields a test-set gain: its dev improvement fails to generalize. A strong, zero-shot GPT-2 gives an 8.0% relative WER reduction on L2-ARCTIC read speech across 24 speakers (four per L1), significant under a speaker-level cluster bootstrap (p = 0.0003) and robust across ASR model sizes (tiny/base/small.en, larger on the weaker models) - but the same strong LM gives no gain on spontaneous Svarah. The error taxonomy explains the pattern: a strong LM can re-rank lexical errors when the n-best contains a better wording, but the roughly half of errors that are accent-driven (51% by phoneme ground truth) remain beyond any text model, bounding the gain and eliminating it on spontaneous speech. Audio-free adaptation is thus a cheap, safe, modest add-on in strong-LM read-speech settings, not a general remedy for the accent gap. Repeating the study on a second ASR family (wav2vec2-CTC) shows the effect is architecture-dependent in a way the oracle bound predicts: lacking an internal LM and with a thinner n-best, even a weak LM helps it, yet LM strength barely matters. All code and derived results are released for reproducibility.</w:t>
       </w:r>
     </w:p>
     <w:p>
@@ -211,7 +211,47 @@
         <w:t xml:space="preserve">An audio-free adaptation study</w:t>
       </w:r>
       <w:r>
-        <w:t xml:space="preserve"> in which a domain n-gram language model, trained only on text and applied via n-best rescoring on the frozen decoder, is evaluated through the same error taxonomy - including an honest per-first-language fairness analysis.</w:t>
+        <w:t xml:space="preserve"> in which weak (n-gram) and strong (neural) text-only LMs, applied via n-best rescoring on the frozen decoder, are evaluated through the same error taxonomy, with a per-first-language fairness analysis and a bootstrap significance test.</w:t>
+      </w:r>
+    </w:p>
+    <w:p>
+      <w:pPr>
+        <w:pStyle w:val="ListParagraph"/>
+        <w:numPr>
+          <w:ilvl w:val="0"/>
+          <w:numId w:val="2"/>
+        </w:numPr>
+        <w:spacing w:after="60"/>
+      </w:pPr>
+      <w:r>
+        <w:rPr>
+          <w:b/>
+          <w:bCs/>
+        </w:rPr>
+        <w:t xml:space="preserve">An oracle-and-ladder analysis</w:t>
+      </w:r>
+      <w:r>
+        <w:t xml:space="preserve"> that bounds audio-free rescoring: an oracle shows half the error is recoverable from the n-best, while an LM-strength ladder (4-gram to GPT-2-xl, plus a fine-tuned in-domain LM) shows the gain saturates at about a quarter of that ceiling - fixing the bound as acoustic, not LM-capacity.</w:t>
+      </w:r>
+    </w:p>
+    <w:p>
+      <w:pPr>
+        <w:pStyle w:val="ListParagraph"/>
+        <w:numPr>
+          <w:ilvl w:val="0"/>
+          <w:numId w:val="2"/>
+        </w:numPr>
+        <w:spacing w:after="60"/>
+      </w:pPr>
+      <w:r>
+        <w:rPr>
+          <w:b/>
+          <w:bCs/>
+        </w:rPr>
+        <w:t xml:space="preserve">A cross-family generality test</w:t>
+      </w:r>
+      <w:r>
+        <w:t xml:space="preserve"> (Whisper vs. wav2vec2-CTC) showing the effect is architecture-dependent and predicted by the framework: n-best diversity (oracle) bounds the gain and the decoder's internal LM determines whether a weak LM suffices.</w:t>
       </w:r>
     </w:p>
     <w:p>
@@ -1407,7 +1447,7 @@
         <w:jc w:val="both"/>
       </w:pPr>
       <w:r>
-        <w:t xml:space="preserve">The backbone is Whisper-small.en (244 M parameters) in faster-whisper/CTranslate2, int8 on CPU and float16 on GPU; beam size 5 (offline) and 10 for n-best (N = 10). We rescore with two LMs of contrasting strength: a weak, pure-Python interpolated 4-gram trained on the in-domain text corpus, and a strong, zero-shot GPT-2 (124 M) scoring each hypothesis by its token log-likelihood. Because the n-best is decoded once and cached, both rescorers run cheaply on the same hypotheses. Phase A on Svarah ran on an 8 GB-RAM CPU (Intel i5-4300U); the heavier all-condition and n-best decoding ran on a free Colab T4 GPU. Offline WER was identical across CPU (int8) and GPU (float16) decoding (0.132 on Svarah), confirming the hardware swap does not affect results. All scores use jiwer [24] with light text normalization (lower-case, punctuation removal).</w:t>
+        <w:t xml:space="preserve">The backbone is Whisper-small.en (244 M parameters) in faster-whisper/CTranslate2, int8 on CPU and float16 on GPU; beam size 5 (offline) and 10 for n-best (N = 10). We rescore with two LMs of contrasting strength: a weak, pure-Python interpolated 4-gram trained on the in-domain text corpus, and a strong, zero-shot GPT-2 (124 M) scoring each hypothesis by its token log-likelihood. Because the n-best is decoded once and cached, both rescorers run cheaply on the same hypotheses. Phase A on Svarah ran on an 8 GB-RAM CPU (Intel i5-4300U); the heavier all-condition and n-best decoding ran on a free Colab T4 GPU. Offline WER was identical across CPU (int8) and GPU (float16) decoding (0.132 on Svarah), confirming the hardware swap does not affect results. All scores use jiwer [24] with light text normalization (lower-case, punctuation removal). For the cross-family generality test (Section 5.6) we additionally decode with wav2vec2-large [11], obtaining its scored n-best via a CTC beam search; lambda is tuned on a wider grid there because CTC acoustic scores are scaled differently.</w:t>
       </w:r>
     </w:p>
     <w:p>
@@ -6968,6 +7008,583 @@
     </w:p>
     <w:p>
       <w:pPr>
+        <w:pStyle w:val="Heading2"/>
+      </w:pPr>
+      <w:r>
+        <w:t xml:space="preserve">5.6  Generality across ASR families: wav2vec2</w:t>
+      </w:r>
+    </w:p>
+    <w:p>
+      <w:pPr>
+        <w:spacing w:after="120" w:line="276"/>
+        <w:jc w:val="both"/>
+      </w:pPr>
+      <w:r>
+        <w:t xml:space="preserve">Are these findings specific to Whisper? We repeat Phase B on a second, architecturally distinct family - wav2vec2-large, a self-supervised CTC model - decoding its scored n-best with a CTC beam search and applying the identical rescoring, oracle and significance pipeline (Table 8). The strong-LM read-speech gain reproduces only directionally (-3.0%), and the cross-family comparison is more revealing than a clean replication: two properties, both read off our own framework, explain the divergence. First, the recoverable head-room differs - wav2vec2's CTC n-best is far less lexically diverse, with an oracle ceiling of only 26% versus Whisper's 50%, so there is little for any LM to exploit, bounding the gain. Second, wav2vec2 (CTC) has no internal LM, so even the weak 4-gram helps it (-4.6%), whereas the same n-gram hurts Whisper, whose attention decoder already carries a strong internal LM. Consequently LM strength barely matters on wav2vec2 - the weak n-gram (-4.6%) and GPT-2 (-3.0%) are comparable and neither is speaker-level significant (GPT-2 p = 0.12) - in sharp contrast to Whisper, where LM strength is decisive and the GPT-2 gain is robust (-8.0%, p = 0.0003). Audio-free rescoring is therefore architecture-dependent in a way the oracle bound and the internal-LM distinction together predict: the recoverable head-room bounds how much any LM can gain, while the presence of an internal LM determines whether a strong LM is required or a weak one suffices. The single-system claim 'a strong LM helps' is thus incomplete; the cross-family view turns it into a predictive account of when and what kind of text-only adaptation helps.</w:t>
+      </w:r>
+    </w:p>
+    <w:tbl>
+      <w:tblPr>
+        <w:tblW w:type="dxa" w:w="9360"/>
+        <w:tblBorders>
+          <w:top w:val="single" w:color="auto" w:sz="4"/>
+          <w:left w:val="single" w:color="auto" w:sz="4"/>
+          <w:bottom w:val="single" w:color="auto" w:sz="4"/>
+          <w:right w:val="single" w:color="auto" w:sz="4"/>
+          <w:insideH w:val="single" w:color="auto" w:sz="4"/>
+          <w:insideV w:val="single" w:color="auto" w:sz="4"/>
+        </w:tblBorders>
+      </w:tblPr>
+      <w:tblGrid>
+        <w:gridCol w:w="3180"/>
+        <w:gridCol w:w="1320"/>
+        <w:gridCol w:w="1140"/>
+        <w:gridCol w:w="1740"/>
+        <w:gridCol w:w="2040"/>
+      </w:tblGrid>
+      <w:tr>
+        <w:trPr>
+          <w:tblHeader/>
+        </w:trPr>
+        <w:tc>
+          <w:tcPr>
+            <w:tcW w:type="dxa" w:w="3180"/>
+            <w:tcBorders>
+              <w:top w:val="single" w:color="BBBBBB" w:sz="1"/>
+              <w:left w:val="single" w:color="BBBBBB" w:sz="1"/>
+              <w:bottom w:val="single" w:color="BBBBBB" w:sz="1"/>
+              <w:right w:val="single" w:color="BBBBBB" w:sz="1"/>
+            </w:tcBorders>
+            <w:shd w:fill="2E5A88" w:val="clear"/>
+            <w:tcMar>
+              <w:top w:type="dxa" w:w="60"/>
+              <w:left w:type="dxa" w:w="110"/>
+              <w:bottom w:type="dxa" w:w="60"/>
+              <w:right w:type="dxa" w:w="110"/>
+            </w:tcMar>
+            <w:vAlign w:val="center"/>
+          </w:tcPr>
+          <w:p>
+            <w:pPr>
+              <w:jc w:val="left"/>
+            </w:pPr>
+            <w:r>
+              <w:rPr>
+                <w:b/>
+                <w:bCs/>
+                <w:color w:val="FFFFFF"/>
+                <w:sz w:val="19"/>
+                <w:szCs w:val="19"/>
+              </w:rPr>
+              <w:t xml:space="preserve">ASR family</w:t>
+            </w:r>
+          </w:p>
+        </w:tc>
+        <w:tc>
+          <w:tcPr>
+            <w:tcW w:type="dxa" w:w="1320"/>
+            <w:tcBorders>
+              <w:top w:val="single" w:color="BBBBBB" w:sz="1"/>
+              <w:left w:val="single" w:color="BBBBBB" w:sz="1"/>
+              <w:bottom w:val="single" w:color="BBBBBB" w:sz="1"/>
+              <w:right w:val="single" w:color="BBBBBB" w:sz="1"/>
+            </w:tcBorders>
+            <w:shd w:fill="2E5A88" w:val="clear"/>
+            <w:tcMar>
+              <w:top w:type="dxa" w:w="60"/>
+              <w:left w:type="dxa" w:w="110"/>
+              <w:bottom w:type="dxa" w:w="60"/>
+              <w:right w:type="dxa" w:w="110"/>
+            </w:tcMar>
+            <w:vAlign w:val="center"/>
+          </w:tcPr>
+          <w:p>
+            <w:pPr>
+              <w:jc w:val="center"/>
+            </w:pPr>
+            <w:r>
+              <w:rPr>
+                <w:b/>
+                <w:bCs/>
+                <w:color w:val="FFFFFF"/>
+                <w:sz w:val="19"/>
+                <w:szCs w:val="19"/>
+              </w:rPr>
+              <w:t xml:space="preserve">Base WER</w:t>
+            </w:r>
+          </w:p>
+        </w:tc>
+        <w:tc>
+          <w:tcPr>
+            <w:tcW w:type="dxa" w:w="1140"/>
+            <w:tcBorders>
+              <w:top w:val="single" w:color="BBBBBB" w:sz="1"/>
+              <w:left w:val="single" w:color="BBBBBB" w:sz="1"/>
+              <w:bottom w:val="single" w:color="BBBBBB" w:sz="1"/>
+              <w:right w:val="single" w:color="BBBBBB" w:sz="1"/>
+            </w:tcBorders>
+            <w:shd w:fill="2E5A88" w:val="clear"/>
+            <w:tcMar>
+              <w:top w:type="dxa" w:w="60"/>
+              <w:left w:type="dxa" w:w="110"/>
+              <w:bottom w:type="dxa" w:w="60"/>
+              <w:right w:type="dxa" w:w="110"/>
+            </w:tcMar>
+            <w:vAlign w:val="center"/>
+          </w:tcPr>
+          <w:p>
+            <w:pPr>
+              <w:jc w:val="center"/>
+            </w:pPr>
+            <w:r>
+              <w:rPr>
+                <w:b/>
+                <w:bCs/>
+                <w:color w:val="FFFFFF"/>
+                <w:sz w:val="19"/>
+                <w:szCs w:val="19"/>
+              </w:rPr>
+              <w:t xml:space="preserve">oracle</w:t>
+            </w:r>
+          </w:p>
+        </w:tc>
+        <w:tc>
+          <w:tcPr>
+            <w:tcW w:type="dxa" w:w="1740"/>
+            <w:tcBorders>
+              <w:top w:val="single" w:color="BBBBBB" w:sz="1"/>
+              <w:left w:val="single" w:color="BBBBBB" w:sz="1"/>
+              <w:bottom w:val="single" w:color="BBBBBB" w:sz="1"/>
+              <w:right w:val="single" w:color="BBBBBB" w:sz="1"/>
+            </w:tcBorders>
+            <w:shd w:fill="2E5A88" w:val="clear"/>
+            <w:tcMar>
+              <w:top w:type="dxa" w:w="60"/>
+              <w:left w:type="dxa" w:w="110"/>
+              <w:bottom w:type="dxa" w:w="60"/>
+              <w:right w:type="dxa" w:w="110"/>
+            </w:tcMar>
+            <w:vAlign w:val="center"/>
+          </w:tcPr>
+          <w:p>
+            <w:pPr>
+              <w:jc w:val="center"/>
+            </w:pPr>
+            <w:r>
+              <w:rPr>
+                <w:b/>
+                <w:bCs/>
+                <w:color w:val="FFFFFF"/>
+                <w:sz w:val="19"/>
+                <w:szCs w:val="19"/>
+              </w:rPr>
+              <w:t xml:space="preserve">4-gram delta</w:t>
+            </w:r>
+          </w:p>
+        </w:tc>
+        <w:tc>
+          <w:tcPr>
+            <w:tcW w:type="dxa" w:w="2040"/>
+            <w:tcBorders>
+              <w:top w:val="single" w:color="BBBBBB" w:sz="1"/>
+              <w:left w:val="single" w:color="BBBBBB" w:sz="1"/>
+              <w:bottom w:val="single" w:color="BBBBBB" w:sz="1"/>
+              <w:right w:val="single" w:color="BBBBBB" w:sz="1"/>
+            </w:tcBorders>
+            <w:shd w:fill="2E5A88" w:val="clear"/>
+            <w:tcMar>
+              <w:top w:type="dxa" w:w="60"/>
+              <w:left w:type="dxa" w:w="110"/>
+              <w:bottom w:type="dxa" w:w="60"/>
+              <w:right w:type="dxa" w:w="110"/>
+            </w:tcMar>
+            <w:vAlign w:val="center"/>
+          </w:tcPr>
+          <w:p>
+            <w:pPr>
+              <w:jc w:val="center"/>
+            </w:pPr>
+            <w:r>
+              <w:rPr>
+                <w:b/>
+                <w:bCs/>
+                <w:color w:val="FFFFFF"/>
+                <w:sz w:val="19"/>
+                <w:szCs w:val="19"/>
+              </w:rPr>
+              <w:t xml:space="preserve">GPT-2 delta</w:t>
+            </w:r>
+          </w:p>
+        </w:tc>
+      </w:tr>
+      <w:tr>
+        <w:trPr>
+          <w:tblHeader w:val="false"/>
+        </w:trPr>
+        <w:tc>
+          <w:tcPr>
+            <w:tcW w:type="dxa" w:w="3180"/>
+            <w:tcBorders>
+              <w:top w:val="single" w:color="BBBBBB" w:sz="1"/>
+              <w:left w:val="single" w:color="BBBBBB" w:sz="1"/>
+              <w:bottom w:val="single" w:color="BBBBBB" w:sz="1"/>
+              <w:right w:val="single" w:color="BBBBBB" w:sz="1"/>
+            </w:tcBorders>
+            <w:shd w:fill="FFFFFF" w:val="clear"/>
+            <w:tcMar>
+              <w:top w:type="dxa" w:w="60"/>
+              <w:left w:type="dxa" w:w="110"/>
+              <w:bottom w:type="dxa" w:w="60"/>
+              <w:right w:type="dxa" w:w="110"/>
+            </w:tcMar>
+            <w:vAlign w:val="center"/>
+          </w:tcPr>
+          <w:p>
+            <w:pPr>
+              <w:jc w:val="left"/>
+            </w:pPr>
+            <w:r>
+              <w:rPr>
+                <w:b w:val="false"/>
+                <w:bCs w:val="false"/>
+                <w:color w:val="000000"/>
+                <w:sz w:val="19"/>
+                <w:szCs w:val="19"/>
+              </w:rPr>
+              <w:t xml:space="preserve">Whisper-small (attn. enc-dec)</w:t>
+            </w:r>
+          </w:p>
+        </w:tc>
+        <w:tc>
+          <w:tcPr>
+            <w:tcW w:type="dxa" w:w="1320"/>
+            <w:tcBorders>
+              <w:top w:val="single" w:color="BBBBBB" w:sz="1"/>
+              <w:left w:val="single" w:color="BBBBBB" w:sz="1"/>
+              <w:bottom w:val="single" w:color="BBBBBB" w:sz="1"/>
+              <w:right w:val="single" w:color="BBBBBB" w:sz="1"/>
+            </w:tcBorders>
+            <w:shd w:fill="FFFFFF" w:val="clear"/>
+            <w:tcMar>
+              <w:top w:type="dxa" w:w="60"/>
+              <w:left w:type="dxa" w:w="110"/>
+              <w:bottom w:type="dxa" w:w="60"/>
+              <w:right w:type="dxa" w:w="110"/>
+            </w:tcMar>
+            <w:vAlign w:val="center"/>
+          </w:tcPr>
+          <w:p>
+            <w:pPr>
+              <w:jc w:val="center"/>
+            </w:pPr>
+            <w:r>
+              <w:rPr>
+                <w:b w:val="false"/>
+                <w:bCs w:val="false"/>
+                <w:color w:val="000000"/>
+                <w:sz w:val="19"/>
+                <w:szCs w:val="19"/>
+              </w:rPr>
+              <w:t xml:space="preserve">0.084</w:t>
+            </w:r>
+          </w:p>
+        </w:tc>
+        <w:tc>
+          <w:tcPr>
+            <w:tcW w:type="dxa" w:w="1140"/>
+            <w:tcBorders>
+              <w:top w:val="single" w:color="BBBBBB" w:sz="1"/>
+              <w:left w:val="single" w:color="BBBBBB" w:sz="1"/>
+              <w:bottom w:val="single" w:color="BBBBBB" w:sz="1"/>
+              <w:right w:val="single" w:color="BBBBBB" w:sz="1"/>
+            </w:tcBorders>
+            <w:shd w:fill="FFFFFF" w:val="clear"/>
+            <w:tcMar>
+              <w:top w:type="dxa" w:w="60"/>
+              <w:left w:type="dxa" w:w="110"/>
+              <w:bottom w:type="dxa" w:w="60"/>
+              <w:right w:type="dxa" w:w="110"/>
+            </w:tcMar>
+            <w:vAlign w:val="center"/>
+          </w:tcPr>
+          <w:p>
+            <w:pPr>
+              <w:jc w:val="center"/>
+            </w:pPr>
+            <w:r>
+              <w:rPr>
+                <w:b w:val="false"/>
+                <w:bCs w:val="false"/>
+                <w:color w:val="000000"/>
+                <w:sz w:val="19"/>
+                <w:szCs w:val="19"/>
+              </w:rPr>
+              <w:t xml:space="preserve">50%</w:t>
+            </w:r>
+          </w:p>
+        </w:tc>
+        <w:tc>
+          <w:tcPr>
+            <w:tcW w:type="dxa" w:w="1740"/>
+            <w:tcBorders>
+              <w:top w:val="single" w:color="BBBBBB" w:sz="1"/>
+              <w:left w:val="single" w:color="BBBBBB" w:sz="1"/>
+              <w:bottom w:val="single" w:color="BBBBBB" w:sz="1"/>
+              <w:right w:val="single" w:color="BBBBBB" w:sz="1"/>
+            </w:tcBorders>
+            <w:shd w:fill="FFFFFF" w:val="clear"/>
+            <w:tcMar>
+              <w:top w:type="dxa" w:w="60"/>
+              <w:left w:type="dxa" w:w="110"/>
+              <w:bottom w:type="dxa" w:w="60"/>
+              <w:right w:type="dxa" w:w="110"/>
+            </w:tcMar>
+            <w:vAlign w:val="center"/>
+          </w:tcPr>
+          <w:p>
+            <w:pPr>
+              <w:jc w:val="center"/>
+            </w:pPr>
+            <w:r>
+              <w:rPr>
+                <w:b w:val="false"/>
+                <w:bCs w:val="false"/>
+                <w:color w:val="000000"/>
+                <w:sz w:val="19"/>
+                <w:szCs w:val="19"/>
+              </w:rPr>
+              <w:t xml:space="preserve">+0.8% (n.s.)</w:t>
+            </w:r>
+          </w:p>
+        </w:tc>
+        <w:tc>
+          <w:tcPr>
+            <w:tcW w:type="dxa" w:w="2040"/>
+            <w:tcBorders>
+              <w:top w:val="single" w:color="BBBBBB" w:sz="1"/>
+              <w:left w:val="single" w:color="BBBBBB" w:sz="1"/>
+              <w:bottom w:val="single" w:color="BBBBBB" w:sz="1"/>
+              <w:right w:val="single" w:color="BBBBBB" w:sz="1"/>
+            </w:tcBorders>
+            <w:shd w:fill="FFFFFF" w:val="clear"/>
+            <w:tcMar>
+              <w:top w:type="dxa" w:w="60"/>
+              <w:left w:type="dxa" w:w="110"/>
+              <w:bottom w:type="dxa" w:w="60"/>
+              <w:right w:type="dxa" w:w="110"/>
+            </w:tcMar>
+            <w:vAlign w:val="center"/>
+          </w:tcPr>
+          <w:p>
+            <w:pPr>
+              <w:jc w:val="center"/>
+            </w:pPr>
+            <w:r>
+              <w:rPr>
+                <w:b w:val="false"/>
+                <w:bCs w:val="false"/>
+                <w:color w:val="000000"/>
+                <w:sz w:val="19"/>
+                <w:szCs w:val="19"/>
+              </w:rPr>
+              <w:t xml:space="preserve">-8.0% (p&lt;0.001)</w:t>
+            </w:r>
+          </w:p>
+        </w:tc>
+      </w:tr>
+      <w:tr>
+        <w:trPr>
+          <w:tblHeader w:val="false"/>
+        </w:trPr>
+        <w:tc>
+          <w:tcPr>
+            <w:tcW w:type="dxa" w:w="3180"/>
+            <w:tcBorders>
+              <w:top w:val="single" w:color="BBBBBB" w:sz="1"/>
+              <w:left w:val="single" w:color="BBBBBB" w:sz="1"/>
+              <w:bottom w:val="single" w:color="BBBBBB" w:sz="1"/>
+              <w:right w:val="single" w:color="BBBBBB" w:sz="1"/>
+            </w:tcBorders>
+            <w:shd w:fill="FFFFFF" w:val="clear"/>
+            <w:tcMar>
+              <w:top w:type="dxa" w:w="60"/>
+              <w:left w:type="dxa" w:w="110"/>
+              <w:bottom w:type="dxa" w:w="60"/>
+              <w:right w:type="dxa" w:w="110"/>
+            </w:tcMar>
+            <w:vAlign w:val="center"/>
+          </w:tcPr>
+          <w:p>
+            <w:pPr>
+              <w:jc w:val="left"/>
+            </w:pPr>
+            <w:r>
+              <w:rPr>
+                <w:b w:val="false"/>
+                <w:bCs w:val="false"/>
+                <w:color w:val="000000"/>
+                <w:sz w:val="19"/>
+                <w:szCs w:val="19"/>
+              </w:rPr>
+              <w:t xml:space="preserve">wav2vec2-large (CTC)</w:t>
+            </w:r>
+          </w:p>
+        </w:tc>
+        <w:tc>
+          <w:tcPr>
+            <w:tcW w:type="dxa" w:w="1320"/>
+            <w:tcBorders>
+              <w:top w:val="single" w:color="BBBBBB" w:sz="1"/>
+              <w:left w:val="single" w:color="BBBBBB" w:sz="1"/>
+              <w:bottom w:val="single" w:color="BBBBBB" w:sz="1"/>
+              <w:right w:val="single" w:color="BBBBBB" w:sz="1"/>
+            </w:tcBorders>
+            <w:shd w:fill="FFFFFF" w:val="clear"/>
+            <w:tcMar>
+              <w:top w:type="dxa" w:w="60"/>
+              <w:left w:type="dxa" w:w="110"/>
+              <w:bottom w:type="dxa" w:w="60"/>
+              <w:right w:type="dxa" w:w="110"/>
+            </w:tcMar>
+            <w:vAlign w:val="center"/>
+          </w:tcPr>
+          <w:p>
+            <w:pPr>
+              <w:jc w:val="center"/>
+            </w:pPr>
+            <w:r>
+              <w:rPr>
+                <w:b w:val="false"/>
+                <w:bCs w:val="false"/>
+                <w:color w:val="000000"/>
+                <w:sz w:val="19"/>
+                <w:szCs w:val="19"/>
+              </w:rPr>
+              <w:t xml:space="preserve">0.070</w:t>
+            </w:r>
+          </w:p>
+        </w:tc>
+        <w:tc>
+          <w:tcPr>
+            <w:tcW w:type="dxa" w:w="1140"/>
+            <w:tcBorders>
+              <w:top w:val="single" w:color="BBBBBB" w:sz="1"/>
+              <w:left w:val="single" w:color="BBBBBB" w:sz="1"/>
+              <w:bottom w:val="single" w:color="BBBBBB" w:sz="1"/>
+              <w:right w:val="single" w:color="BBBBBB" w:sz="1"/>
+            </w:tcBorders>
+            <w:shd w:fill="FFFFFF" w:val="clear"/>
+            <w:tcMar>
+              <w:top w:type="dxa" w:w="60"/>
+              <w:left w:type="dxa" w:w="110"/>
+              <w:bottom w:type="dxa" w:w="60"/>
+              <w:right w:type="dxa" w:w="110"/>
+            </w:tcMar>
+            <w:vAlign w:val="center"/>
+          </w:tcPr>
+          <w:p>
+            <w:pPr>
+              <w:jc w:val="center"/>
+            </w:pPr>
+            <w:r>
+              <w:rPr>
+                <w:b w:val="false"/>
+                <w:bCs w:val="false"/>
+                <w:color w:val="000000"/>
+                <w:sz w:val="19"/>
+                <w:szCs w:val="19"/>
+              </w:rPr>
+              <w:t xml:space="preserve">26%</w:t>
+            </w:r>
+          </w:p>
+        </w:tc>
+        <w:tc>
+          <w:tcPr>
+            <w:tcW w:type="dxa" w:w="1740"/>
+            <w:tcBorders>
+              <w:top w:val="single" w:color="BBBBBB" w:sz="1"/>
+              <w:left w:val="single" w:color="BBBBBB" w:sz="1"/>
+              <w:bottom w:val="single" w:color="BBBBBB" w:sz="1"/>
+              <w:right w:val="single" w:color="BBBBBB" w:sz="1"/>
+            </w:tcBorders>
+            <w:shd w:fill="FFFFFF" w:val="clear"/>
+            <w:tcMar>
+              <w:top w:type="dxa" w:w="60"/>
+              <w:left w:type="dxa" w:w="110"/>
+              <w:bottom w:type="dxa" w:w="60"/>
+              <w:right w:type="dxa" w:w="110"/>
+            </w:tcMar>
+            <w:vAlign w:val="center"/>
+          </w:tcPr>
+          <w:p>
+            <w:pPr>
+              <w:jc w:val="center"/>
+            </w:pPr>
+            <w:r>
+              <w:rPr>
+                <w:b w:val="false"/>
+                <w:bCs w:val="false"/>
+                <w:color w:val="000000"/>
+                <w:sz w:val="19"/>
+                <w:szCs w:val="19"/>
+              </w:rPr>
+              <w:t xml:space="preserve">-4.6%</w:t>
+            </w:r>
+          </w:p>
+        </w:tc>
+        <w:tc>
+          <w:tcPr>
+            <w:tcW w:type="dxa" w:w="2040"/>
+            <w:tcBorders>
+              <w:top w:val="single" w:color="BBBBBB" w:sz="1"/>
+              <w:left w:val="single" w:color="BBBBBB" w:sz="1"/>
+              <w:bottom w:val="single" w:color="BBBBBB" w:sz="1"/>
+              <w:right w:val="single" w:color="BBBBBB" w:sz="1"/>
+            </w:tcBorders>
+            <w:shd w:fill="FFFFFF" w:val="clear"/>
+            <w:tcMar>
+              <w:top w:type="dxa" w:w="60"/>
+              <w:left w:type="dxa" w:w="110"/>
+              <w:bottom w:type="dxa" w:w="60"/>
+              <w:right w:type="dxa" w:w="110"/>
+            </w:tcMar>
+            <w:vAlign w:val="center"/>
+          </w:tcPr>
+          <w:p>
+            <w:pPr>
+              <w:jc w:val="center"/>
+            </w:pPr>
+            <w:r>
+              <w:rPr>
+                <w:b w:val="false"/>
+                <w:bCs w:val="false"/>
+                <w:color w:val="000000"/>
+                <w:sz w:val="19"/>
+                <w:szCs w:val="19"/>
+              </w:rPr>
+              <w:t xml:space="preserve">-3.0% (n.s.)</w:t>
+            </w:r>
+          </w:p>
+        </w:tc>
+      </w:tr>
+    </w:tbl>
+    <w:p>
+      <w:pPr>
+        <w:spacing w:after="200" w:before="80"/>
+        <w:jc w:val="center"/>
+      </w:pPr>
+      <w:r>
+        <w:rPr>
+          <w:i/>
+          <w:iCs/>
+          <w:sz w:val="19"/>
+          <w:szCs w:val="19"/>
+        </w:rPr>
+        <w:t xml:space="preserve">Table 8: Phase B across two ASR families (L2-ARCTIC, 24 speakers, test split). The oracle head-room bounds the gain's magnitude; the internal LM determines whether a weak LM suffices. delta is relative WER at the dev-tuned lambda.</w:t>
+      </w:r>
+    </w:p>
+    <w:p>
+      <w:pPr>
         <w:pStyle w:val="Heading1"/>
       </w:pPr>
       <w:r>
@@ -7001,7 +7618,7 @@
         <w:spacing w:after="60"/>
       </w:pPr>
       <w:r>
-        <w:t xml:space="preserve">Scale: results use seeded subsamples; the read-speech effect is confirmed on all 24 L2-ARCTIC speakers (four per L1, speaker-level p = 0.0003) and across three ASR model sizes, but the corpora remain modest in size and English-only, and Svarah is evaluated on 150 clips. Larger and more diverse evaluation would further tighten the estimates.</w:t>
+        <w:t xml:space="preserve">Scale: results use seeded subsamples; the read-speech effect is confirmed on all 24 L2-ARCTIC speakers (four per L1, speaker-level p = 0.0003) and across three ASR model sizes, but the corpora remain modest in size and English-only, and Svarah is evaluated on 150 clips. The cross-family generality test (wav2vec2) is on one read corpus, and its single-LM gain - though directionally consistent and mechanistically explained - is not robustly significant; broader replication across families and corpora would further tighten the account. Larger and more diverse evaluation would further tighten the estimates.</w:t>
       </w:r>
     </w:p>
     <w:p>

</xml_diff>

<commit_message>
Add cross-family figure (Fig 10) and EdAcc replication infrastructure
</commit_message>
<xml_diff>
--- a/paper/ASR_L2_paper.docx
+++ b/paper/ASR_L2_paper.docx
@@ -7020,7 +7020,7 @@
         <w:jc w:val="both"/>
       </w:pPr>
       <w:r>
-        <w:t xml:space="preserve">Are these findings specific to Whisper? We repeat Phase B on a second, architecturally distinct family - wav2vec2-large, a self-supervised CTC model - decoding its scored n-best with a CTC beam search and applying the identical rescoring, oracle and significance pipeline (Table 8). The strong-LM read-speech gain reproduces only directionally (-3.0%), and the cross-family comparison is more revealing than a clean replication: two properties, both read off our own framework, explain the divergence. First, the recoverable head-room differs - wav2vec2's CTC n-best is far less lexically diverse, with an oracle ceiling of only 26% versus Whisper's 50%, so there is little for any LM to exploit, bounding the gain. Second, wav2vec2 (CTC) has no internal LM, so even the weak 4-gram helps it (-4.6%), whereas the same n-gram hurts Whisper, whose attention decoder already carries a strong internal LM. Consequently LM strength barely matters on wav2vec2 - the weak n-gram (-4.6%) and GPT-2 (-3.0%) are comparable and neither is speaker-level significant (GPT-2 p = 0.12) - in sharp contrast to Whisper, where LM strength is decisive and the GPT-2 gain is robust (-8.0%, p = 0.0003). Audio-free rescoring is therefore architecture-dependent in a way the oracle bound and the internal-LM distinction together predict: the recoverable head-room bounds how much any LM can gain, while the presence of an internal LM determines whether a strong LM is required or a weak one suffices. The single-system claim 'a strong LM helps' is thus incomplete; the cross-family view turns it into a predictive account of when and what kind of text-only adaptation helps.</w:t>
+        <w:t xml:space="preserve">Are these findings specific to Whisper? We repeat Phase B on a second, architecturally distinct family - wav2vec2-large, a self-supervised CTC model - decoding its scored n-best with a CTC beam search and applying the identical rescoring, oracle and significance pipeline (Table 8). The strong-LM read-speech gain reproduces only directionally (-3.0%), and the cross-family comparison is more revealing than a clean replication: two properties, both read off our own framework, explain the divergence. First, the recoverable head-room differs - wav2vec2's CTC n-best is far less lexically diverse, with an oracle ceiling of only 26% versus Whisper's 50%, so there is little for any LM to exploit, bounding the gain. Second, wav2vec2 (CTC) has no internal LM, so even the weak 4-gram helps it (-4.6%), whereas the same n-gram hurts Whisper, whose attention decoder already carries a strong internal LM. Consequently LM strength barely matters on wav2vec2 - the weak n-gram (-4.6%) and GPT-2 (-3.0%) are comparable and neither is speaker-level significant (GPT-2 p = 0.12) - in sharp contrast to Whisper, where LM strength is decisive and the GPT-2 gain is robust (-8.0%, p = 0.0003); Figure 10 makes the contrast visible. Audio-free rescoring is therefore architecture-dependent in a way the oracle bound and the internal-LM distinction together predict: the recoverable head-room bounds how much any LM can gain, while the presence of an internal LM determines whether a strong LM is required or a weak one suffices. The single-system claim 'a strong LM helps' is thus incomplete; the cross-family view turns it into a predictive account of when and what kind of text-only adaptation helps.</w:t>
       </w:r>
     </w:p>
     <w:tbl>
@@ -7581,6 +7581,67 @@
           <w:szCs w:val="19"/>
         </w:rPr>
         <w:t xml:space="preserve">Table 8: Phase B across two ASR families (L2-ARCTIC, 24 speakers, test split). The oracle head-room bounds the gain's magnitude; the internal LM determines whether a weak LM suffices. delta is relative WER at the dev-tuned lambda.</w:t>
+      </w:r>
+    </w:p>
+    <w:p>
+      <w:pPr>
+        <w:spacing w:before="120"/>
+        <w:jc w:val="center"/>
+      </w:pPr>
+      <w:r>
+        <w:drawing>
+          <wp:inline distT="0" distB="0" distL="0" distR="0">
+            <wp:extent cx="4476750" cy="2952750"/>
+            <wp:effectExtent t="0" r="0" b="0" l="0"/>
+            <wp:docPr id="1" name="fig_crossfamily.png" descr="fig_crossfamily.png" title="fig_crossfamily.png"/>
+            <wp:cNvGraphicFramePr>
+              <a:graphicFrameLocks xmlns:a="http://schemas.openxmlformats.org/drawingml/2006/main" noChangeAspect="1"/>
+            </wp:cNvGraphicFramePr>
+            <a:graphic xmlns:a="http://schemas.openxmlformats.org/drawingml/2006/main">
+              <a:graphicData uri="http://schemas.openxmlformats.org/drawingml/2006/picture">
+                <pic:pic xmlns:pic="http://schemas.openxmlformats.org/drawingml/2006/picture">
+                  <pic:nvPicPr>
+                    <pic:cNvPr id="0" name="" descr=""/>
+                    <pic:cNvPicPr>
+                      <a:picLocks noChangeAspect="1" noChangeArrowheads="1"/>
+                    </pic:cNvPicPr>
+                  </pic:nvPicPr>
+                  <pic:blipFill>
+                    <a:blip r:embed="rId17" cstate="none"/>
+                    <a:srcRect/>
+                    <a:stretch>
+                      <a:fillRect/>
+                    </a:stretch>
+                  </pic:blipFill>
+                  <pic:spPr bwMode="auto">
+                    <a:xfrm>
+                      <a:off x="0" y="0"/>
+                      <a:ext cx="4476750" cy="2952750"/>
+                    </a:xfrm>
+                    <a:prstGeom prst="rect">
+                      <a:avLst/>
+                    </a:prstGeom>
+                  </pic:spPr>
+                </pic:pic>
+              </a:graphicData>
+            </a:graphic>
+          </wp:inline>
+        </w:drawing>
+      </w:r>
+    </w:p>
+    <w:p>
+      <w:pPr>
+        <w:spacing w:after="200" w:before="80"/>
+        <w:jc w:val="center"/>
+      </w:pPr>
+      <w:r>
+        <w:rPr>
+          <w:i/>
+          <w:iCs/>
+          <w:sz w:val="19"/>
+          <w:szCs w:val="19"/>
+        </w:rPr>
+        <w:t xml:space="preserve">Figure 10: Cross-family contrast. On Whisper (internal LM, rich n-best) LM strength is decisive - the weak 4-gram hurts (+0.8%) while GPT-2 helps strongly (-8.0%). On wav2vec2 (CTC, no internal LM, thinner n-best: 26% vs 50% oracle) both LMs give a comparable, modest gain - LM strength barely matters. The effect is architecture-dependent, as the oracle bound and internal-LM distinction predict.</w:t>
       </w:r>
     </w:p>
     <w:p>

</xml_diff>